<commit_message>
Add video and other crucial documents for submitting
</commit_message>
<xml_diff>
--- a/Document/Assignment2 - Lowkenuinely - Report.docx
+++ b/Document/Assignment2 - Lowkenuinely - Report.docx
@@ -18,9 +18,9 @@
           <w:lang w:val="en-US"/>
         </w:rPr>
       </w:pPr>
-      <w:bookmarkStart w:id="0" w:name="_Toc1248"/>
-      <w:bookmarkStart w:id="1" w:name="_Toc25351"/>
-      <w:bookmarkStart w:id="2" w:name="_Toc19506"/>
+      <w:bookmarkStart w:id="0" w:name="_Toc19506"/>
+      <w:bookmarkStart w:id="1" w:name="_Toc1248"/>
+      <w:bookmarkStart w:id="2" w:name="_Toc25351"/>
       <w:r>
         <w:rPr>
           <w:rFonts w:hint="default" w:ascii="Times New Roman" w:hAnsi="Times New Roman" w:cs="Times New Roman"/>
@@ -123,9 +123,9 @@
           <w:lang w:val="en-US"/>
         </w:rPr>
       </w:pPr>
-      <w:bookmarkStart w:id="3" w:name="_Toc6709"/>
+      <w:bookmarkStart w:id="3" w:name="_Toc1139"/>
       <w:bookmarkStart w:id="4" w:name="_Toc4586"/>
-      <w:bookmarkStart w:id="5" w:name="_Toc1139"/>
+      <w:bookmarkStart w:id="5" w:name="_Toc6709"/>
       <w:r>
         <w:rPr>
           <w:rFonts w:hint="default" w:ascii="Times New Roman" w:hAnsi="Times New Roman" w:cs="Times New Roman"/>
@@ -622,6 +622,8 @@
         </w:rPr>
         <w:t>: Mr. Hoang (Author) Nguyen</w:t>
       </w:r>
+      <w:bookmarkStart w:id="9" w:name="_GoBack"/>
+      <w:bookmarkEnd w:id="9"/>
     </w:p>
     <w:p>
       <w:pPr>
@@ -994,6 +996,23 @@
         </w:rPr>
         <w:t xml:space="preserve">Word Count: </w:t>
       </w:r>
+      <w:r>
+        <w:rPr>
+          <w:rFonts w:hint="default" w:ascii="Times New Roman" w:hAnsi="Times New Roman" w:cs="Times New Roman"/>
+          <w:b w:val="0"/>
+          <w:bCs w:val="0"/>
+          <w:i w:val="0"/>
+          <w:iCs w:val="0"/>
+          <w:caps w:val="0"/>
+          <w:color w:val="auto"/>
+          <w:spacing w:val="0"/>
+          <w:sz w:val="25"/>
+          <w:szCs w:val="25"/>
+          <w:shd w:val="clear" w:fill="FFFFFF"/>
+          <w:lang w:val="en-US"/>
+        </w:rPr>
+        <w:t>2966 words</w:t>
+      </w:r>
     </w:p>
     <w:p>
       <w:pPr>
@@ -1008,9 +1027,9 @@
           <w:shd w:val="clear" w:color="auto" w:fill="auto"/>
         </w:rPr>
       </w:pPr>
-      <w:bookmarkStart w:id="6" w:name="_Toc166571946"/>
-      <w:bookmarkStart w:id="7" w:name="_Toc3434"/>
-      <w:bookmarkStart w:id="8" w:name="_Toc19771"/>
+      <w:bookmarkStart w:id="6" w:name="_Toc19771"/>
+      <w:bookmarkStart w:id="7" w:name="_Toc166571946"/>
+      <w:bookmarkStart w:id="8" w:name="_Toc3434"/>
       <w:r>
         <w:rPr>
           <w:rFonts w:hint="default" w:ascii="Times New Roman" w:hAnsi="Times New Roman" w:cs="Times New Roman"/>
@@ -3239,7 +3258,6 @@
             <w:insideH w:val="none" w:color="auto" w:sz="0" w:space="0"/>
             <w:insideV w:val="none" w:color="auto" w:sz="0" w:space="0"/>
           </w:tblBorders>
-          <w:shd w:val="clear" w:color="auto" w:fill="auto"/>
           <w:tblCellMar>
             <w:top w:w="15" w:type="dxa"/>
             <w:left w:w="15" w:type="dxa"/>
@@ -3516,7 +3534,6 @@
             <w:insideH w:val="none" w:color="auto" w:sz="0" w:space="0"/>
             <w:insideV w:val="none" w:color="auto" w:sz="0" w:space="0"/>
           </w:tblBorders>
-          <w:shd w:val="clear" w:color="auto" w:fill="auto"/>
           <w:tblCellMar>
             <w:top w:w="15" w:type="dxa"/>
             <w:left w:w="15" w:type="dxa"/>
@@ -3785,7 +3802,6 @@
             <w:insideH w:val="none" w:color="auto" w:sz="0" w:space="0"/>
             <w:insideV w:val="none" w:color="auto" w:sz="0" w:space="0"/>
           </w:tblBorders>
-          <w:shd w:val="clear" w:color="auto" w:fill="auto"/>
           <w:tblCellMar>
             <w:top w:w="15" w:type="dxa"/>
             <w:left w:w="15" w:type="dxa"/>
@@ -4054,7 +4070,6 @@
             <w:insideH w:val="none" w:color="auto" w:sz="0" w:space="0"/>
             <w:insideV w:val="none" w:color="auto" w:sz="0" w:space="0"/>
           </w:tblBorders>
-          <w:shd w:val="clear" w:color="auto" w:fill="auto"/>
           <w:tblCellMar>
             <w:top w:w="15" w:type="dxa"/>
             <w:left w:w="15" w:type="dxa"/>
@@ -4323,7 +4338,6 @@
             <w:insideH w:val="none" w:color="auto" w:sz="0" w:space="0"/>
             <w:insideV w:val="none" w:color="auto" w:sz="0" w:space="0"/>
           </w:tblBorders>
-          <w:shd w:val="clear" w:color="auto" w:fill="auto"/>
           <w:tblCellMar>
             <w:top w:w="15" w:type="dxa"/>
             <w:left w:w="15" w:type="dxa"/>
@@ -5258,6 +5272,7 @@
             <w:insideH w:val="none" w:color="auto" w:sz="0" w:space="0"/>
             <w:insideV w:val="none" w:color="auto" w:sz="0" w:space="0"/>
           </w:tblBorders>
+          <w:shd w:val="clear" w:color="auto" w:fill="auto"/>
           <w:tblCellMar>
             <w:top w:w="15" w:type="dxa"/>
             <w:left w:w="15" w:type="dxa"/>
@@ -5488,6 +5503,7 @@
             <w:insideH w:val="none" w:color="auto" w:sz="0" w:space="0"/>
             <w:insideV w:val="none" w:color="auto" w:sz="0" w:space="0"/>
           </w:tblBorders>
+          <w:shd w:val="clear" w:color="auto" w:fill="auto"/>
           <w:tblCellMar>
             <w:top w:w="15" w:type="dxa"/>
             <w:left w:w="15" w:type="dxa"/>
@@ -5917,6 +5933,7 @@
             <w:insideH w:val="none" w:color="auto" w:sz="0" w:space="0"/>
             <w:insideV w:val="none" w:color="auto" w:sz="0" w:space="0"/>
           </w:tblBorders>
+          <w:shd w:val="clear" w:color="auto" w:fill="auto"/>
           <w:tblCellMar>
             <w:top w:w="15" w:type="dxa"/>
             <w:left w:w="15" w:type="dxa"/>
@@ -6131,6 +6148,7 @@
             <w:insideH w:val="none" w:color="auto" w:sz="0" w:space="0"/>
             <w:insideV w:val="none" w:color="auto" w:sz="0" w:space="0"/>
           </w:tblBorders>
+          <w:shd w:val="clear" w:color="auto" w:fill="auto"/>
           <w:tblCellMar>
             <w:top w:w="15" w:type="dxa"/>
             <w:left w:w="15" w:type="dxa"/>
@@ -6345,6 +6363,7 @@
             <w:insideH w:val="none" w:color="auto" w:sz="0" w:space="0"/>
             <w:insideV w:val="none" w:color="auto" w:sz="0" w:space="0"/>
           </w:tblBorders>
+          <w:shd w:val="clear" w:color="auto" w:fill="auto"/>
           <w:tblCellMar>
             <w:top w:w="15" w:type="dxa"/>
             <w:left w:w="15" w:type="dxa"/>
@@ -6559,6 +6578,7 @@
             <w:insideH w:val="none" w:color="auto" w:sz="0" w:space="0"/>
             <w:insideV w:val="none" w:color="auto" w:sz="0" w:space="0"/>
           </w:tblBorders>
+          <w:shd w:val="clear" w:color="auto" w:fill="auto"/>
           <w:tblCellMar>
             <w:top w:w="15" w:type="dxa"/>
             <w:left w:w="15" w:type="dxa"/>
@@ -6802,6 +6822,7 @@
             <w:insideH w:val="none" w:color="auto" w:sz="0" w:space="0"/>
             <w:insideV w:val="none" w:color="auto" w:sz="0" w:space="0"/>
           </w:tblBorders>
+          <w:shd w:val="clear" w:color="auto" w:fill="auto"/>
           <w:tblCellMar>
             <w:top w:w="15" w:type="dxa"/>
             <w:left w:w="15" w:type="dxa"/>
@@ -7016,6 +7037,7 @@
             <w:insideH w:val="none" w:color="auto" w:sz="0" w:space="0"/>
             <w:insideV w:val="none" w:color="auto" w:sz="0" w:space="0"/>
           </w:tblBorders>
+          <w:shd w:val="clear" w:color="auto" w:fill="auto"/>
           <w:tblCellMar>
             <w:top w:w="15" w:type="dxa"/>
             <w:left w:w="15" w:type="dxa"/>
@@ -7230,6 +7252,7 @@
             <w:insideH w:val="none" w:color="auto" w:sz="0" w:space="0"/>
             <w:insideV w:val="none" w:color="auto" w:sz="0" w:space="0"/>
           </w:tblBorders>
+          <w:shd w:val="clear" w:color="auto" w:fill="auto"/>
           <w:tblCellMar>
             <w:top w:w="15" w:type="dxa"/>
             <w:left w:w="15" w:type="dxa"/>
@@ -9554,8 +9577,6 @@
         </w:rPr>
         <w:t>The Objective Function shown above is the core mathematical rule used during the training process in our system. Furthermore, its main goal is to find the perfect balance between two things: maximizing the margin (the distance between Spam and Ham groups) and minimizing the penalty for any classification errors. By solving this formula, the Linear SVM model generates a clear boundary that allows the system to accurately detect malicious messages while maintaining high processing speeds.</w:t>
       </w:r>
-      <w:bookmarkStart w:id="9" w:name="_GoBack"/>
-      <w:bookmarkEnd w:id="9"/>
     </w:p>
     <w:p>
       <w:pPr>
@@ -13922,7 +13943,7 @@
       <w:fldChar w:fldCharType="separate"/>
     </w:r>
     <w:r>
-      <w:t>14/03/2026</w:t>
+      <w:t>15/03/2026</w:t>
     </w:r>
     <w:r>
       <w:fldChar w:fldCharType="end"/>

</xml_diff>